<commit_message>
add IEEE Word document with correct author info (Muhammed Emir Seçer, Fırat Üniversitesi)
Agent-Logs-Url: https://github.com/emirsecer1/ECGAnomaliDetection/sessions/61f40411-0977-412e-b928-934ddbc7e217

Co-authored-by: emirsecer1 <158167678+emirsecer1@users.noreply.github.com>
</commit_message>
<xml_diff>
--- a/ECG_CNN_VAE_IEEE.docx
+++ b/ECG_CNN_VAE_IEEE.docx
@@ -60,34 +60,72 @@
         </w:rPr>
       </w:pPr>
       <w:r>
-        <w:t xml:space="preserve">Yazar Adı Soyadı</w:t>
-      </w:r>
-      <w:r>
-        <w:br/>
-      </w:r>
-      <w:r>
-        <w:t xml:space="preserve">Bilgisayar Mühendisliği Bölümü</w:t>
-      </w:r>
-      <w:r>
-        <w:br/>
-      </w:r>
-      <w:r>
-        <w:t xml:space="preserve">Üniversite Adı</w:t>
-      </w:r>
-      <w:r>
-        <w:br/>
-      </w:r>
-      <w:r>
-        <w:t xml:space="preserve">Şehir, Türkiye</w:t>
-      </w:r>
-      <w:r>
-        <w:br/>
-      </w:r>
-      <w:r>
-        <w:t xml:space="preserve">email@example.com</w:t>
-      </w:r>
-      <w:r>
-        <w:br/>
+        <w:rPr>
+          <w:b/>
+          <w:sz w:val="18"/>
+          <w:szCs w:val="18"/>
+        </w:rPr>
+        <w:t xml:space="preserve">Muhammed Emir Seçer</w:t>
+      </w:r>
+      <w:r>
+        <w:rPr>
+          <w:sz w:val="18"/>
+          <w:szCs w:val="18"/>
+        </w:rPr>
+        <w:br w:type="textWrapping"/>
+      </w:r>
+      <w:r>
+        <w:rPr>
+          <w:i/>
+          <w:iCs/>
+          <w:sz w:val="18"/>
+          <w:szCs w:val="18"/>
+        </w:rPr>
+        <w:t xml:space="preserve">Mekatronik Mühendisliği Bölümü</w:t>
+      </w:r>
+      <w:r>
+        <w:rPr>
+          <w:sz w:val="18"/>
+          <w:szCs w:val="18"/>
+        </w:rPr>
+        <w:br w:type="textWrapping"/>
+      </w:r>
+      <w:r>
+        <w:rPr>
+          <w:i/>
+          <w:iCs/>
+          <w:sz w:val="18"/>
+          <w:szCs w:val="18"/>
+        </w:rPr>
+        <w:t xml:space="preserve">Fırat Üniversitesi</w:t>
+      </w:r>
+      <w:r>
+        <w:rPr>
+          <w:sz w:val="18"/>
+          <w:szCs w:val="18"/>
+        </w:rPr>
+        <w:br w:type="textWrapping"/>
+      </w:r>
+      <w:r>
+        <w:rPr>
+          <w:sz w:val="18"/>
+          <w:szCs w:val="18"/>
+        </w:rPr>
+        <w:t xml:space="preserve">Elazığ, Türkiye</w:t>
+      </w:r>
+      <w:r>
+        <w:rPr>
+          <w:sz w:val="18"/>
+          <w:szCs w:val="18"/>
+        </w:rPr>
+        <w:br w:type="textWrapping"/>
+      </w:r>
+      <w:r>
+        <w:rPr>
+          <w:sz w:val="18"/>
+          <w:szCs w:val="18"/>
+        </w:rPr>
+        <w:t xml:space="preserve">muhammedemirsecer@gmail.com</w:t>
       </w:r>
     </w:p>
     <w:p>

</xml_diff>